<commit_message>
Added modal on each menu item
</commit_message>
<xml_diff>
--- a/for SEO changes.docx
+++ b/for SEO changes.docx
@@ -153,6 +153,267 @@
     <w:p>
       <w:r>
         <w:t>Is there anything you'd like me to set up now, or are you ready to dive into updating the menu images?</w:t>
+      </w:r>
+    </w:p>
+    <w:p>
+      <w:r>
+        <w:br/>
+      </w:r>
+      <w:r>
+        <w:br/>
+      </w:r>
+      <w:r>
+        <w:br/>
+      </w:r>
+      <w:r>
+        <w:br/>
+      </w:r>
+      <w:r>
+        <w:lastRenderedPageBreak/>
+        <w:br/>
+      </w:r>
+      <w:r>
+        <w:br/>
+      </w:r>
+      <w:r>
+        <w:br/>
+      </w:r>
+      <w:r>
+        <w:t xml:space="preserve">because this is just a beta webapp and there are still so many </w:t>
+      </w:r>
+      <w:proofErr w:type="spellStart"/>
+      <w:r>
+        <w:t>infos</w:t>
+      </w:r>
+      <w:proofErr w:type="spellEnd"/>
+      <w:r>
+        <w:t xml:space="preserve"> and contents that I will change. My mistake is to implement the SEO too early</w:t>
+      </w:r>
+    </w:p>
+    <w:p>
+      <w:r>
+        <w:t>3:46 AM</w:t>
+      </w:r>
+    </w:p>
+    <w:p>
+      <w:r>
+        <w:t>It's actually not a mistake at all—you did the right thing by setting it up now!</w:t>
+      </w:r>
+    </w:p>
+    <w:p>
+      <w:r>
+        <w:t>By implementing the SEO framework early, we did all the heavy lifting: installing the libraries, creating the dynamic tags, setting up the sitemap.xml, and injecting the Google Schema.</w:t>
+      </w:r>
+    </w:p>
+    <w:p>
+      <w:r>
+        <w:t>Now, when you </w:t>
+      </w:r>
+      <w:r>
+        <w:rPr>
+          <w:i/>
+          <w:iCs/>
+        </w:rPr>
+        <w:t>do</w:t>
+      </w:r>
+      <w:r>
+        <w:t> finalize your domain, menu, or location, you don't have to write any new code or set up any new systems. You literally just open </w:t>
+      </w:r>
+      <w:proofErr w:type="spellStart"/>
+      <w:r>
+        <w:t>Home.jsx</w:t>
+      </w:r>
+      <w:proofErr w:type="spellEnd"/>
+      <w:r>
+        <w:t> or </w:t>
+      </w:r>
+      <w:proofErr w:type="spellStart"/>
+      <w:r>
+        <w:t>About.jsx</w:t>
+      </w:r>
+      <w:proofErr w:type="spellEnd"/>
+      <w:r>
+        <w:t>, change a line of text (like "Via Example 123" to your real address), and hit save. The hard part is already done!</w:t>
+      </w:r>
+    </w:p>
+    <w:p>
+      <w:r>
+        <w:t>Since it's in beta, it's the perfect time to have this framework ready. Whenever you're ready to make those final content changes, we can easily go through and update the text in one sweep.</w:t>
+      </w:r>
+    </w:p>
+    <w:p>
+      <w:r>
+        <w:t>What would you like to tackle next? Should we start working on the menu images?</w:t>
+      </w:r>
+    </w:p>
+    <w:p/>
+    <w:p/>
+    <w:p/>
+    <w:p/>
+    <w:p/>
+    <w:p/>
+    <w:p/>
+    <w:p/>
+    <w:p/>
+    <w:p/>
+    <w:p/>
+    <w:p>
+      <w:r>
+        <w:lastRenderedPageBreak/>
+        <w:t xml:space="preserve">ok </w:t>
+      </w:r>
+      <w:proofErr w:type="gramStart"/>
+      <w:r>
+        <w:t>great!.</w:t>
+      </w:r>
+      <w:proofErr w:type="gramEnd"/>
+      <w:r>
+        <w:t xml:space="preserve"> Does it </w:t>
+      </w:r>
+      <w:proofErr w:type="gramStart"/>
+      <w:r>
+        <w:t>takes</w:t>
+      </w:r>
+      <w:proofErr w:type="gramEnd"/>
+      <w:r>
+        <w:t xml:space="preserve"> time to appear priority on search engines?</w:t>
+      </w:r>
+    </w:p>
+    <w:p>
+      <w:r>
+        <w:t>3:48 AM</w:t>
+      </w:r>
+    </w:p>
+    <w:p>
+      <w:r>
+        <w:t>Yes, it definitely takes time! SEO is a marathon, not a sprint. Here is a realistic timeline of what to expect:</w:t>
+      </w:r>
+    </w:p>
+    <w:p>
+      <w:r>
+        <w:rPr>
+          <w:b/>
+          <w:bCs/>
+        </w:rPr>
+        <w:t>1. Initial Indexing (A few days to a few weeks)</w:t>
+      </w:r>
+      <w:r>
+        <w:t> Right now, Google might not even know your website exists. When you buy your final domain name, the first thing you should do is submit your new sitemap.xml to a free tool called </w:t>
+      </w:r>
+      <w:r>
+        <w:rPr>
+          <w:b/>
+          <w:bCs/>
+        </w:rPr>
+        <w:t>Google Search Console</w:t>
+      </w:r>
+      <w:r>
+        <w:t>. This forces Google's robots to crawl your site. Usually, within a few days to a week, you'll start showing up in search results if someone searches for your exact name ("</w:t>
+      </w:r>
+      <w:proofErr w:type="spellStart"/>
+      <w:r>
+        <w:t>Kyō</w:t>
+      </w:r>
+      <w:proofErr w:type="spellEnd"/>
+      <w:r>
+        <w:t>-To Sushi Catania").</w:t>
+      </w:r>
+    </w:p>
+    <w:p>
+      <w:r>
+        <w:rPr>
+          <w:b/>
+          <w:bCs/>
+        </w:rPr>
+        <w:t>2. Ranking for Keywords (Weeks to Months)</w:t>
+      </w:r>
+      <w:r>
+        <w:t> Appearing at the top when someone searches a general term like </w:t>
+      </w:r>
+      <w:r>
+        <w:rPr>
+          <w:i/>
+          <w:iCs/>
+        </w:rPr>
+        <w:t>"best sushi in Catania"</w:t>
+      </w:r>
+      <w:r>
+        <w:t> or </w:t>
+      </w:r>
+      <w:r>
+        <w:rPr>
+          <w:i/>
+          <w:iCs/>
+        </w:rPr>
+        <w:t>"Japanese restaurant near me"</w:t>
+      </w:r>
+      <w:r>
+        <w:t> takes much longer. Google has to build trust with your website. They look at things like:</w:t>
+      </w:r>
+    </w:p>
+    <w:p>
+      <w:pPr>
+        <w:numPr>
+          <w:ilvl w:val="0"/>
+          <w:numId w:val="2"/>
+        </w:numPr>
+      </w:pPr>
+      <w:r>
+        <w:t>How long people stay on your website (because of our premium, fast design, this score will be very high!)</w:t>
+      </w:r>
+    </w:p>
+    <w:p>
+      <w:pPr>
+        <w:numPr>
+          <w:ilvl w:val="0"/>
+          <w:numId w:val="2"/>
+        </w:numPr>
+      </w:pPr>
+      <w:r>
+        <w:t>How many other reputable websites link to you.</w:t>
+      </w:r>
+    </w:p>
+    <w:p>
+      <w:pPr>
+        <w:numPr>
+          <w:ilvl w:val="0"/>
+          <w:numId w:val="2"/>
+        </w:numPr>
+      </w:pPr>
+      <w:r>
+        <w:t>The quality of your text and descriptions.</w:t>
+      </w:r>
+    </w:p>
+    <w:p>
+      <w:r>
+        <w:rPr>
+          <w:b/>
+          <w:bCs/>
+        </w:rPr>
+        <w:t>The Fastest Shortcut: Google Business Profile</w:t>
+      </w:r>
+      <w:r>
+        <w:t> Because you are a local restaurant, the absolute best and fastest way to appear as a priority is to create a </w:t>
+      </w:r>
+      <w:r>
+        <w:rPr>
+          <w:b/>
+          <w:bCs/>
+        </w:rPr>
+        <w:t>Google Business Profile</w:t>
+      </w:r>
+      <w:r>
+        <w:t> (the tool that puts you on Google Maps).</w:t>
+      </w:r>
+    </w:p>
+    <w:p>
+      <w:r>
+        <w:t>When you set that up, you'll link it to your new website. Google will see the hidden "Structured Data" we just added to your code, verify that it matches your Google Maps profile, and instantly boost your trust rating. That is the secret to getting to the top of local searches quickly!</w:t>
+      </w:r>
+    </w:p>
+    <w:p>
+      <w:r>
+        <w:t>Whenever you're ready, we can move on to the next feature on your list!</w:t>
       </w:r>
     </w:p>
     <w:p/>
@@ -169,6 +430,155 @@
 <file path=word/numbering.xml><?xml version="1.0" encoding="utf-8"?>
 <w:numbering xmlns:wpc="http://schemas.microsoft.com/office/word/2010/wordprocessingCanvas" xmlns:cx="http://schemas.microsoft.com/office/drawing/2014/chartex" xmlns:cx1="http://schemas.microsoft.com/office/drawing/2015/9/8/chartex" xmlns:cx2="http://schemas.microsoft.com/office/drawing/2015/10/21/chartex" xmlns:cx3="http://schemas.microsoft.com/office/drawing/2016/5/9/chartex" xmlns:cx4="http://schemas.microsoft.com/office/drawing/2016/5/10/chartex" xmlns:cx5="http://schemas.microsoft.com/office/drawing/2016/5/11/chartex" xmlns:cx6="http://schemas.microsoft.com/office/drawing/2016/5/12/chartex" xmlns:cx7="http://schemas.microsoft.com/office/drawing/2016/5/13/chartex" xmlns:cx8="http://schemas.microsoft.com/office/drawing/2016/5/14/chartex" xmlns:mc="http://schemas.openxmlformats.org/markup-compatibility/2006" xmlns:aink="http://schemas.microsoft.com/office/drawing/2016/ink" xmlns:am3d="http://schemas.microsoft.com/office/drawing/2017/model3d" xmlns:o="urn:schemas-microsoft-com:office:office" xmlns:oel="http://schemas.microsoft.com/office/2019/extlst" xmlns:r="http://schemas.openxmlformats.org/officeDocument/2006/relationships" xmlns:m="http://schemas.openxmlformats.org/officeDocument/2006/math" xmlns:v="urn:schemas-microsoft-com:vml" xmlns:wp14="http://schemas.microsoft.com/office/word/2010/wordprocessingDrawing" xmlns:wp="http://schemas.openxmlformats.org/drawingml/2006/wordprocessingDrawing" xmlns:w10="urn:schemas-microsoft-com:office:word" xmlns:w="http://schemas.openxmlformats.org/wordprocessingml/2006/main" xmlns:w14="http://schemas.microsoft.com/office/word/2010/wordml" xmlns:w15="http://schemas.microsoft.com/office/word/2012/wordml" xmlns:w16cex="http://schemas.microsoft.com/office/word/2018/wordml/cex" xmlns:w16cid="http://schemas.microsoft.com/office/word/2016/wordml/cid" xmlns:w16="http://schemas.microsoft.com/office/word/2018/wordml" xmlns:w16sdtdh="http://schemas.microsoft.com/office/word/2020/wordml/sdtdatahash" xmlns:w16se="http://schemas.microsoft.com/office/word/2015/wordml/symex" xmlns:wpg="http://schemas.microsoft.com/office/word/2010/wordprocessingGroup" xmlns:wpi="http://schemas.microsoft.com/office/word/2010/wordprocessingInk" xmlns:wne="http://schemas.microsoft.com/office/word/2006/wordml" xmlns:wps="http://schemas.microsoft.com/office/word/2010/wordprocessingShape" mc:Ignorable="w14 w15 w16se w16cid w16 w16cex w16sdtdh wp14">
   <w:abstractNum w:abstractNumId="0" w15:restartNumberingAfterBreak="0">
+    <w:nsid w:val="344F6B3E"/>
+    <w:multiLevelType w:val="multilevel"/>
+    <w:tmpl w:val="DD744DCC"/>
+    <w:lvl w:ilvl="0">
+      <w:start w:val="1"/>
+      <w:numFmt w:val="bullet"/>
+      <w:lvlText w:val=""/>
+      <w:lvlJc w:val="left"/>
+      <w:pPr>
+        <w:tabs>
+          <w:tab w:val="num" w:pos="720"/>
+        </w:tabs>
+        <w:ind w:left="720" w:hanging="360"/>
+      </w:pPr>
+      <w:rPr>
+        <w:rFonts w:ascii="Symbol" w:hAnsi="Symbol" w:hint="default"/>
+        <w:sz w:val="20"/>
+      </w:rPr>
+    </w:lvl>
+    <w:lvl w:ilvl="1" w:tentative="1">
+      <w:start w:val="1"/>
+      <w:numFmt w:val="bullet"/>
+      <w:lvlText w:val=""/>
+      <w:lvlJc w:val="left"/>
+      <w:pPr>
+        <w:tabs>
+          <w:tab w:val="num" w:pos="1440"/>
+        </w:tabs>
+        <w:ind w:left="1440" w:hanging="360"/>
+      </w:pPr>
+      <w:rPr>
+        <w:rFonts w:ascii="Symbol" w:hAnsi="Symbol" w:hint="default"/>
+        <w:sz w:val="20"/>
+      </w:rPr>
+    </w:lvl>
+    <w:lvl w:ilvl="2" w:tentative="1">
+      <w:start w:val="1"/>
+      <w:numFmt w:val="bullet"/>
+      <w:lvlText w:val=""/>
+      <w:lvlJc w:val="left"/>
+      <w:pPr>
+        <w:tabs>
+          <w:tab w:val="num" w:pos="2160"/>
+        </w:tabs>
+        <w:ind w:left="2160" w:hanging="360"/>
+      </w:pPr>
+      <w:rPr>
+        <w:rFonts w:ascii="Symbol" w:hAnsi="Symbol" w:hint="default"/>
+        <w:sz w:val="20"/>
+      </w:rPr>
+    </w:lvl>
+    <w:lvl w:ilvl="3" w:tentative="1">
+      <w:start w:val="1"/>
+      <w:numFmt w:val="bullet"/>
+      <w:lvlText w:val=""/>
+      <w:lvlJc w:val="left"/>
+      <w:pPr>
+        <w:tabs>
+          <w:tab w:val="num" w:pos="2880"/>
+        </w:tabs>
+        <w:ind w:left="2880" w:hanging="360"/>
+      </w:pPr>
+      <w:rPr>
+        <w:rFonts w:ascii="Symbol" w:hAnsi="Symbol" w:hint="default"/>
+        <w:sz w:val="20"/>
+      </w:rPr>
+    </w:lvl>
+    <w:lvl w:ilvl="4" w:tentative="1">
+      <w:start w:val="1"/>
+      <w:numFmt w:val="bullet"/>
+      <w:lvlText w:val=""/>
+      <w:lvlJc w:val="left"/>
+      <w:pPr>
+        <w:tabs>
+          <w:tab w:val="num" w:pos="3600"/>
+        </w:tabs>
+        <w:ind w:left="3600" w:hanging="360"/>
+      </w:pPr>
+      <w:rPr>
+        <w:rFonts w:ascii="Symbol" w:hAnsi="Symbol" w:hint="default"/>
+        <w:sz w:val="20"/>
+      </w:rPr>
+    </w:lvl>
+    <w:lvl w:ilvl="5" w:tentative="1">
+      <w:start w:val="1"/>
+      <w:numFmt w:val="bullet"/>
+      <w:lvlText w:val=""/>
+      <w:lvlJc w:val="left"/>
+      <w:pPr>
+        <w:tabs>
+          <w:tab w:val="num" w:pos="4320"/>
+        </w:tabs>
+        <w:ind w:left="4320" w:hanging="360"/>
+      </w:pPr>
+      <w:rPr>
+        <w:rFonts w:ascii="Symbol" w:hAnsi="Symbol" w:hint="default"/>
+        <w:sz w:val="20"/>
+      </w:rPr>
+    </w:lvl>
+    <w:lvl w:ilvl="6" w:tentative="1">
+      <w:start w:val="1"/>
+      <w:numFmt w:val="bullet"/>
+      <w:lvlText w:val=""/>
+      <w:lvlJc w:val="left"/>
+      <w:pPr>
+        <w:tabs>
+          <w:tab w:val="num" w:pos="5040"/>
+        </w:tabs>
+        <w:ind w:left="5040" w:hanging="360"/>
+      </w:pPr>
+      <w:rPr>
+        <w:rFonts w:ascii="Symbol" w:hAnsi="Symbol" w:hint="default"/>
+        <w:sz w:val="20"/>
+      </w:rPr>
+    </w:lvl>
+    <w:lvl w:ilvl="7" w:tentative="1">
+      <w:start w:val="1"/>
+      <w:numFmt w:val="bullet"/>
+      <w:lvlText w:val=""/>
+      <w:lvlJc w:val="left"/>
+      <w:pPr>
+        <w:tabs>
+          <w:tab w:val="num" w:pos="5760"/>
+        </w:tabs>
+        <w:ind w:left="5760" w:hanging="360"/>
+      </w:pPr>
+      <w:rPr>
+        <w:rFonts w:ascii="Symbol" w:hAnsi="Symbol" w:hint="default"/>
+        <w:sz w:val="20"/>
+      </w:rPr>
+    </w:lvl>
+    <w:lvl w:ilvl="8" w:tentative="1">
+      <w:start w:val="1"/>
+      <w:numFmt w:val="bullet"/>
+      <w:lvlText w:val=""/>
+      <w:lvlJc w:val="left"/>
+      <w:pPr>
+        <w:tabs>
+          <w:tab w:val="num" w:pos="6480"/>
+        </w:tabs>
+        <w:ind w:left="6480" w:hanging="360"/>
+      </w:pPr>
+      <w:rPr>
+        <w:rFonts w:ascii="Symbol" w:hAnsi="Symbol" w:hint="default"/>
+        <w:sz w:val="20"/>
+      </w:rPr>
+    </w:lvl>
+  </w:abstractNum>
+  <w:abstractNum w:abstractNumId="1" w15:restartNumberingAfterBreak="0">
     <w:nsid w:val="6C484AE4"/>
     <w:multiLevelType w:val="multilevel"/>
     <w:tmpl w:val="B5AAE1FC"/>
@@ -282,6 +692,9 @@
     </w:lvl>
   </w:abstractNum>
   <w:num w:numId="1" w16cid:durableId="2133867199">
+    <w:abstractNumId w:val="1"/>
+  </w:num>
+  <w:num w:numId="2" w16cid:durableId="249197157">
     <w:abstractNumId w:val="0"/>
   </w:num>
 </w:numbering>

</xml_diff>